<commit_message>
feat(.cortex): add /debug autonomous debugging engine command
- add .cortex/commands/debug.md (491 lines): full-stack trace, value tracking, root cause identification, multi-file fix, self-healing loop, test verification
- add .claude/commands/debug.md thin wrapper and register "debug" in commands.json
- flag system: --deep, --ui, --backend, --value, --fix, --loop + input flags --endpoint, --file, --error, --payload with priority rules and defaults
- update CLAUDE.md, README.md, documentation/commands.md, overview.md, architecture.md with full /debug reference including flags, pipeline, and usage examples
- update documentation/HLD.docx to v3.2.0: document history entry, command count 13 -> 14 across all tables, lifecycle and benefits sections updated
affects: 10 file(s) on dev-subhan
</commit_message>
<xml_diff>
--- a/documentation/HLD.docx
+++ b/documentation/HLD.docx
@@ -36,7 +36,7 @@
         <w:rPr>
           <w:i/>
         </w:rPr>
-        <w:t>Version: 3.1.0   |   Framework: Cortex   |   Date: 2026-04-13   |   Status: APPROVED</w:t>
+        <w:t>Version: 3.2.0   |   Framework: Cortex   |   Date: 2026-04-13   |   Status: APPROVED</w:t>
       </w:r>
     </w:p>
     <w:p>
@@ -137,7 +137,7 @@
           </w:tcPr>
           <w:p>
             <w:r>
-              <w:t>3.1.0</w:t>
+              <w:t>3.2.0</w:t>
             </w:r>
           </w:p>
         </w:tc>
@@ -596,6 +596,48 @@
           </w:p>
         </w:tc>
       </w:tr>
+      <w:tr>
+        <w:tc>
+          <w:tcPr>
+            <w:tcW w:type="dxa" w:w="1152"/>
+          </w:tcPr>
+          <w:p>
+            <w:r>
+              <w:t>3.2.0</w:t>
+            </w:r>
+          </w:p>
+        </w:tc>
+        <w:tc>
+          <w:tcPr>
+            <w:tcW w:type="dxa" w:w="1728"/>
+          </w:tcPr>
+          <w:p>
+            <w:r>
+              <w:t>2026-04-13</w:t>
+            </w:r>
+          </w:p>
+        </w:tc>
+        <w:tc>
+          <w:tcPr>
+            <w:tcW w:type="dxa" w:w="1728"/>
+          </w:tcPr>
+          <w:p>
+            <w:r>
+              <w:t>subhan.a</w:t>
+            </w:r>
+          </w:p>
+        </w:tc>
+        <w:tc>
+          <w:tcPr>
+            <w:tcW w:type="dxa" w:w="4752"/>
+          </w:tcPr>
+          <w:p>
+            <w:r>
+              <w:t>/debug autonomous debugging command (v1.0.0): full-stack trace, value tracking, self-healing loop, test verification; 14 commands total; flags: --deep, --ui, --backend, --value, --fix, --loop + input flags (--endpoint, --file, --error, --payload)</w:t>
+            </w:r>
+          </w:p>
+        </w:tc>
+      </w:tr>
     </w:tbl>
     <w:p/>
     <w:p>
@@ -791,7 +833,7 @@
           </w:tcPr>
           <w:p>
             <w:r>
-              <w:t>13 .cortex/commands/*.md implementations</w:t>
+              <w:t>14 .cortex/commands/*.md implementations</w:t>
             </w:r>
           </w:p>
         </w:tc>
@@ -2711,7 +2753,7 @@
         <w:rPr>
           <w:i w:val="0"/>
         </w:rPr>
-        <w:t>Cortex v3.1.0 is fully deployed and operational. The framework consists of three active hook layers (guard, runtime, session), a registry-driven scanner tier covering 25 languages, 13 Markdown-defined slash commands, and a portable adapter layer. All hook versions match the registry. The prompt optimizer is at v1.6.0 with intent detection, keyword-based file discovery, and the --y binary-decision flag. The pre-guard risk engine is at v2.2.0 with configurable warn/block thresholds via cortex.config.json. The post-scan scanner dispatcher is at v2.5.0 with CORTEX_MAX_JOBS concurrency control, hash-based file caching (7-day TTL), and path-traversal protection.</w:t>
+        <w:t>Cortex v3.2.0 is fully deployed and operational. The framework consists of three active hook layers (guard, runtime, session), a registry-driven scanner tier covering 25 languages, 14 Markdown-defined slash commands, and a portable adapter layer. All hook versions match the registry. The prompt optimizer is at v1.6.0 with intent detection, keyword-based file discovery, and the --y binary-decision flag. The pre-guard risk engine is at v2.2.0 with configurable warn/block thresholds via cortex.config.json. The post-scan scanner dispatcher is at v2.5.0 with CORTEX_MAX_JOBS concurrency control, hash-based file caching (7-day TTL), and path-traversal protection.</w:t>
       </w:r>
     </w:p>
     <w:p>
@@ -2912,7 +2954,7 @@
         <w:pStyle w:val="ListBullet"/>
       </w:pPr>
       <w:r>
-        <w:t xml:space="preserve">  |-- commands/              13 Markdown command implementations</w:t>
+        <w:t xml:space="preserve">  |-- commands/              14 Markdown command implementations</w:t>
       </w:r>
     </w:p>
     <w:p>
@@ -6185,7 +6227,7 @@
           </w:tcPr>
           <w:p>
             <w:r>
-              <w:t>13 slash commands covering full development lifecycle: commit -&gt; impact -&gt; PR check -&gt; regression -&gt; documentation</w:t>
+              <w:t>14 slash commands covering full development lifecycle: commit -&gt; impact -&gt; PR check -&gt; regression -&gt; debug -&gt; documentation</w:t>
             </w:r>
           </w:p>
         </w:tc>
@@ -8205,7 +8247,7 @@
           </w:tcPr>
           <w:p>
             <w:r>
-              <w:t>/commit, /impact, /pr-check, /regression, etc.</w:t>
+              <w:t>/commit, /impact, /pr-check, /regression, /debug, etc.</w:t>
             </w:r>
           </w:p>
         </w:tc>

</xml_diff>